<commit_message>
Update project write-up to reflect the skill-node-type fix
Added iteration 8 (the brief-compliance gap check and fix), corrected
the query-answered count from the final eval run (3/10 -> 6/10, not the
earlier 5/10), updated the node count/types in the dataset section
(324 nodes across 5 types including skill), and added a learning about
re-checking the original brief against actual code rather than memory
of the plan. Regenerated the .docx via pandoc.

Co-Authored-By: Claude Sonnet 5 <noreply@anthropic.com>
</commit_message>
<xml_diff>
--- a/docs/PROJECT_WRITEUP.docx
+++ b/docs/PROJECT_WRITEUP.docx
@@ -1163,13 +1163,34 @@
         <w:t xml:space="preserve"> </w:t>
       </w:r>
       <w:r>
-        <w:t xml:space="preserve">produced 300+ nodes (well past the 20-node minimum) across contributor,</w:t>
-      </w:r>
-      <w:r>
-        <w:t xml:space="preserve"> </w:t>
-      </w:r>
-      <w:r>
-        <w:t xml:space="preserve">PR, issue, and module node types.</w:t>
+        <w:t xml:space="preserve">produced 324 nodes (well past the 20-node minimum) across five node</w:t>
+      </w:r>
+      <w:r>
+        <w:t xml:space="preserve"> </w:t>
+      </w:r>
+      <w:r>
+        <w:t xml:space="preserve">types: contributor, PR, issue, module, and</w:t>
+      </w:r>
+      <w:r>
+        <w:t xml:space="preserve"> </w:t>
+      </w:r>
+      <w:r>
+        <w:rPr>
+          <w:b/>
+        </w:rPr>
+        <w:t xml:space="preserve">skill</w:t>
+      </w:r>
+      <w:r>
+        <w:t xml:space="preserve"> </w:t>
+      </w:r>
+      <w:r>
+        <w:t xml:space="preserve">(tools/technologies</w:t>
+      </w:r>
+      <w:r>
+        <w:t xml:space="preserve"> </w:t>
+      </w:r>
+      <w:r>
+        <w:t xml:space="preserve">— see the graph schema note below).</w:t>
       </w:r>
     </w:p>
     <w:p>
@@ -2285,7 +2306,7 @@
         <w:t xml:space="preserve"> </w:t>
       </w:r>
       <w:r>
-        <w:t xml:space="preserve">the fix (vector arm went from 3/10 to 5/10 queries answered, with</w:t>
+        <w:t xml:space="preserve">the fix (vector arm went from 3/10 to 6/10 queries answered, with</w:t>
       </w:r>
       <w:r>
         <w:t xml:space="preserve"> </w:t>
@@ -2296,16 +2317,7 @@
     </w:p>
     <w:p>
       <w:pPr>
-        <w:pStyle w:val="Heading2"/>
-      </w:pPr>
-      <w:bookmarkStart w:id="31" w:name="learnings-observations"/>
-      <w:bookmarkEnd w:id="31"/>
-      <w:r>
-        <w:t xml:space="preserve">5. Learnings / Observations</w:t>
-      </w:r>
-    </w:p>
-    <w:p>
-      <w:pPr>
+        <w:pStyle w:val="Compact"/>
         <w:numPr>
           <w:numId w:val="1003"/>
           <w:ilvl w:val="0"/>
@@ -2315,7 +2327,7 @@
         <w:rPr>
           <w:b/>
         </w:rPr>
-        <w:t xml:space="preserve">A system that never gets run end-to-end will hide bugs that only</w:t>
+        <w:t xml:space="preserve">A gap against the original project brief, found by re-reading the</w:t>
       </w:r>
       <w:r>
         <w:rPr>
@@ -2327,55 +2339,73 @@
         <w:rPr>
           <w:b/>
         </w:rPr>
-        <w:t xml:space="preserve">exist end-to-end.</w:t>
-      </w:r>
-      <w:r>
-        <w:t xml:space="preserve"> </w:t>
-      </w:r>
-      <w:r>
-        <w:t xml:space="preserve">Two of the more consequential bugs in this project</w:t>
-      </w:r>
-      <w:r>
-        <w:t xml:space="preserve"> </w:t>
-      </w:r>
-      <w:r>
-        <w:t xml:space="preserve">(the</w:t>
-      </w:r>
-      <w:r>
-        <w:t xml:space="preserve"> </w:t>
+        <w:t xml:space="preserve">brief against the actual code rather than from memory.</w:t>
+      </w:r>
+      <w:r>
+        <w:t xml:space="preserve"> </w:t>
+      </w:r>
+      <w:r>
+        <w:t xml:space="preserve">The brief</w:t>
+      </w:r>
+      <w:r>
+        <w:t xml:space="preserve"> </w:t>
+      </w:r>
+      <w:r>
+        <w:t xml:space="preserve">models org knowledge as people/projects/</w:t>
+      </w:r>
+      <w:r>
+        <w:rPr>
+          <w:b/>
+        </w:rPr>
+        <w:t xml:space="preserve">skills</w:t>
+      </w:r>
+      <w:r>
+        <w:t xml:space="preserve">/documents/</w:t>
+      </w:r>
+      <w:r>
+        <w:t xml:space="preserve"> </w:t>
+      </w:r>
+      <w:r>
+        <w:t xml:space="preserve">decisions. The graph schema covered four of the five — no "skill"</w:t>
+      </w:r>
+      <w:r>
+        <w:t xml:space="preserve"> </w:t>
+      </w:r>
+      <w:r>
+        <w:t xml:space="preserve">node type existed. Rather than invent an arbitrary keyword scan,</w:t>
+      </w:r>
+      <w:r>
+        <w:t xml:space="preserve"> </w:t>
+      </w:r>
+      <w:r>
+        <w:t xml:space="preserve">looked for a convention this specific corpus already uses reliably:</w:t>
+      </w:r>
+      <w:r>
+        <w:t xml:space="preserve"> </w:t>
+      </w:r>
+      <w:r>
+        <w:t xml:space="preserve">conventional-commit title scopes (</w:t>
       </w:r>
       <w:r>
         <w:rPr>
           <w:rStyle w:val="VerbatimChar"/>
         </w:rPr>
-        <w:t xml:space="preserve">.env</w:t>
-      </w:r>
-      <w:r>
-        <w:t xml:space="preserve">-never-loaded ingestion hang, and the generation truncation</w:t>
-      </w:r>
-      <w:r>
-        <w:t xml:space="preserve"> </w:t>
-      </w:r>
-      <w:r>
-        <w:t xml:space="preserve">on a larger corpus) were invisible to unit-level checks and only</w:t>
-      </w:r>
-      <w:r>
-        <w:t xml:space="preserve"> </w:t>
-      </w:r>
-      <w:r>
-        <w:t xml:space="preserve">surfaced by actually running the real pipeline against real data — the</w:t>
-      </w:r>
-      <w:r>
-        <w:t xml:space="preserve"> </w:t>
-      </w:r>
-      <w:r>
-        <w:t xml:space="preserve">first by watching a wall-clock timer, the second by reading an actual</w:t>
-      </w:r>
-      <w:r>
-        <w:t xml:space="preserve"> </w:t>
-      </w:r>
-      <w:r>
-        <w:t xml:space="preserve">rendered UI screenshot rather than trusting a</w:t>
+        <w:t xml:space="preserve">fix(anthropic): ...</w:t>
+      </w:r>
+      <w:r>
+        <w:t xml:space="preserve">) and</w:t>
+      </w:r>
+      <w:r>
+        <w:t xml:space="preserve"> </w:t>
+      </w:r>
+      <w:r>
+        <w:t xml:space="preserve">Dependabot-style "bump X from A to B" titles both name real</w:t>
+      </w:r>
+      <w:r>
+        <w:t xml:space="preserve"> </w:t>
+      </w:r>
+      <w:r>
+        <w:t xml:space="preserve">tools/technologies. Added a</w:t>
       </w:r>
       <w:r>
         <w:t xml:space="preserve"> </w:t>
@@ -2384,19 +2414,98 @@
         <w:rPr>
           <w:rStyle w:val="VerbatimChar"/>
         </w:rPr>
-        <w:t xml:space="preserve">refused: False</w:t>
-      </w:r>
-      <w:r>
-        <w:t xml:space="preserve"> </w:t>
-      </w:r>
-      <w:r>
-        <w:t xml:space="preserve">flag.</w:t>
+        <w:t xml:space="preserve">skill</w:t>
+      </w:r>
+      <w:r>
+        <w:t xml:space="preserve"> </w:t>
+      </w:r>
+      <w:r>
+        <w:t xml:space="preserve">node type and a</w:t>
+      </w:r>
+      <w:r>
+        <w:t xml:space="preserve"> </w:t>
+      </w:r>
+      <w:r>
+        <w:rPr>
+          <w:rStyle w:val="VerbatimChar"/>
+        </w:rPr>
+        <w:t xml:space="preserve">uses</w:t>
+      </w:r>
+      <w:r>
+        <w:t xml:space="preserve"> </w:t>
+      </w:r>
+      <w:r>
+        <w:t xml:space="preserve">edge</w:t>
+      </w:r>
+      <w:r>
+        <w:t xml:space="preserve"> </w:t>
+      </w:r>
+      <w:r>
+        <w:t xml:space="preserve">sourced from those two patterns (the commit-scope source is</w:t>
+      </w:r>
+      <w:r>
+        <w:t xml:space="preserve"> </w:t>
+      </w:r>
+      <w:r>
+        <w:t xml:space="preserve">intersected with a curated allowlist so internal module scopes like</w:t>
+      </w:r>
+      <w:r>
+        <w:t xml:space="preserve"> </w:t>
+      </w:r>
+      <w:r>
+        <w:t xml:space="preserve">"core" or "infra" aren't misclassified as external tools). No new</w:t>
+      </w:r>
+      <w:r>
+        <w:t xml:space="preserve"> </w:t>
+      </w:r>
+      <w:r>
+        <w:t xml:space="preserve">edge type was needed to answer "what tools did a contributor use" —</w:t>
+      </w:r>
+      <w:r>
+        <w:t xml:space="preserve"> </w:t>
+      </w:r>
+      <w:r>
+        <w:t xml:space="preserve">that's the same 2-hop traversal pattern already used for</w:t>
+      </w:r>
+      <w:r>
+        <w:t xml:space="preserve"> </w:t>
+      </w:r>
+      <w:r>
+        <w:t xml:space="preserve">contributor→module. Verified end-to-end against the brief's own</w:t>
+      </w:r>
+      <w:r>
+        <w:t xml:space="preserve"> </w:t>
+      </w:r>
+      <w:r>
+        <w:t xml:space="preserve">example query shape ("what did X work on and what tools did they</w:t>
+      </w:r>
+      <w:r>
+        <w:t xml:space="preserve"> </w:t>
+      </w:r>
+      <w:r>
+        <w:t xml:space="preserve">use") — it now answers with a dedicated, fully-cited "Tools / skills</w:t>
+      </w:r>
+      <w:r>
+        <w:t xml:space="preserve"> </w:t>
+      </w:r>
+      <w:r>
+        <w:t xml:space="preserve">used" section.</w:t>
+      </w:r>
+    </w:p>
+    <w:p>
+      <w:pPr>
+        <w:pStyle w:val="Heading2"/>
+      </w:pPr>
+      <w:bookmarkStart w:id="31" w:name="learnings-observations"/>
+      <w:bookmarkEnd w:id="31"/>
+      <w:r>
+        <w:t xml:space="preserve">5. Learnings / Observations</w:t>
       </w:r>
     </w:p>
     <w:p>
       <w:pPr>
         <w:numPr>
-          <w:numId w:val="1003"/>
+          <w:numId w:val="1004"/>
           <w:ilvl w:val="0"/>
         </w:numPr>
       </w:pPr>
@@ -2404,67 +2513,88 @@
         <w:rPr>
           <w:b/>
         </w:rPr>
-        <w:t xml:space="preserve">A "confidence score" is often measuring the wrong thing.</w:t>
-      </w:r>
-      <w:r>
-        <w:t xml:space="preserve"> </w:t>
-      </w:r>
-      <w:r>
-        <w:t xml:space="preserve">The</w:t>
-      </w:r>
-      <w:r>
-        <w:t xml:space="preserve"> </w:t>
-      </w:r>
-      <w:r>
-        <w:t xml:space="preserve">cross-encoder's reranked score measures topical relevance between a</w:t>
-      </w:r>
-      <w:r>
-        <w:t xml:space="preserve"> </w:t>
-      </w:r>
-      <w:r>
-        <w:t xml:space="preserve">query and a passage — not whether that passage actually contains the</w:t>
-      </w:r>
-      <w:r>
-        <w:t xml:space="preserve"> </w:t>
-      </w:r>
-      <w:r>
-        <w:t xml:space="preserve">fact being asked for. A query can retrieve the exactly-right document</w:t>
-      </w:r>
-      <w:r>
-        <w:t xml:space="preserve"> </w:t>
-      </w:r>
-      <w:r>
-        <w:t xml:space="preserve">with high confidence and still have no answer inside it (PR title</w:t>
-      </w:r>
-      <w:r>
-        <w:t xml:space="preserve"> </w:t>
-      </w:r>
-      <w:r>
-        <w:t xml:space="preserve">present, author absent) — the system's job then is to say so, not to</w:t>
-      </w:r>
-      <w:r>
-        <w:t xml:space="preserve"> </w:t>
-      </w:r>
-      <w:r>
-        <w:t xml:space="preserve">either hallucinate or refuse outright. That distinction — evidence</w:t>
-      </w:r>
-      <w:r>
-        <w:t xml:space="preserve"> </w:t>
-      </w:r>
-      <w:r>
-        <w:t xml:space="preserve">found vs. evidence sufficient — isn't something a single threshold can</w:t>
-      </w:r>
-      <w:r>
-        <w:t xml:space="preserve"> </w:t>
-      </w:r>
-      <w:r>
-        <w:t xml:space="preserve">fully capture.</w:t>
+        <w:t xml:space="preserve">A system that never gets run end-to-end will hide bugs that only</w:t>
+      </w:r>
+      <w:r>
+        <w:rPr>
+          <w:b/>
+        </w:rPr>
+        <w:t xml:space="preserve"> </w:t>
+      </w:r>
+      <w:r>
+        <w:rPr>
+          <w:b/>
+        </w:rPr>
+        <w:t xml:space="preserve">exist end-to-end.</w:t>
+      </w:r>
+      <w:r>
+        <w:t xml:space="preserve"> </w:t>
+      </w:r>
+      <w:r>
+        <w:t xml:space="preserve">Two of the more consequential bugs in this project</w:t>
+      </w:r>
+      <w:r>
+        <w:t xml:space="preserve"> </w:t>
+      </w:r>
+      <w:r>
+        <w:t xml:space="preserve">(the</w:t>
+      </w:r>
+      <w:r>
+        <w:t xml:space="preserve"> </w:t>
+      </w:r>
+      <w:r>
+        <w:rPr>
+          <w:rStyle w:val="VerbatimChar"/>
+        </w:rPr>
+        <w:t xml:space="preserve">.env</w:t>
+      </w:r>
+      <w:r>
+        <w:t xml:space="preserve">-never-loaded ingestion hang, and the generation truncation</w:t>
+      </w:r>
+      <w:r>
+        <w:t xml:space="preserve"> </w:t>
+      </w:r>
+      <w:r>
+        <w:t xml:space="preserve">on a larger corpus) were invisible to unit-level checks and only</w:t>
+      </w:r>
+      <w:r>
+        <w:t xml:space="preserve"> </w:t>
+      </w:r>
+      <w:r>
+        <w:t xml:space="preserve">surfaced by actually running the real pipeline against real data — the</w:t>
+      </w:r>
+      <w:r>
+        <w:t xml:space="preserve"> </w:t>
+      </w:r>
+      <w:r>
+        <w:t xml:space="preserve">first by watching a wall-clock timer, the second by reading an actual</w:t>
+      </w:r>
+      <w:r>
+        <w:t xml:space="preserve"> </w:t>
+      </w:r>
+      <w:r>
+        <w:t xml:space="preserve">rendered UI screenshot rather than trusting a</w:t>
+      </w:r>
+      <w:r>
+        <w:t xml:space="preserve"> </w:t>
+      </w:r>
+      <w:r>
+        <w:rPr>
+          <w:rStyle w:val="VerbatimChar"/>
+        </w:rPr>
+        <w:t xml:space="preserve">refused: False</w:t>
+      </w:r>
+      <w:r>
+        <w:t xml:space="preserve"> </w:t>
+      </w:r>
+      <w:r>
+        <w:t xml:space="preserve">flag.</w:t>
       </w:r>
     </w:p>
     <w:p>
       <w:pPr>
         <w:numPr>
-          <w:numId w:val="1003"/>
+          <w:numId w:val="1004"/>
           <w:ilvl w:val="0"/>
         </w:numPr>
       </w:pPr>
@@ -2472,82 +2602,67 @@
         <w:rPr>
           <w:b/>
         </w:rPr>
-        <w:t xml:space="preserve">An initial diagnosis of "needs retuning" was too shallow, and saying</w:t>
-      </w:r>
-      <w:r>
-        <w:rPr>
-          <w:b/>
-        </w:rPr>
-        <w:t xml:space="preserve"> </w:t>
-      </w:r>
-      <w:r>
-        <w:rPr>
-          <w:b/>
-        </w:rPr>
-        <w:t xml:space="preserve">so explicitly was the right call.</w:t>
-      </w:r>
-      <w:r>
-        <w:t xml:space="preserve"> </w:t>
-      </w:r>
-      <w:r>
-        <w:t xml:space="preserve">The first-pass write-up flagged a</w:t>
-      </w:r>
-      <w:r>
-        <w:t xml:space="preserve"> </w:t>
-      </w:r>
-      <w:r>
-        <w:t xml:space="preserve">confidence threshold as needing recalibration. One level deeper, the</w:t>
-      </w:r>
-      <w:r>
-        <w:t xml:space="preserve"> </w:t>
-      </w:r>
-      <w:r>
-        <w:t xml:space="preserve">real causes were two specific, structural bugs (a missing identifier in</w:t>
-      </w:r>
-      <w:r>
-        <w:t xml:space="preserve"> </w:t>
-      </w:r>
-      <w:r>
-        <w:t xml:space="preserve">indexed text; a reranker blind spot on self-referential-less passages)</w:t>
-      </w:r>
-      <w:r>
-        <w:t xml:space="preserve"> </w:t>
-      </w:r>
-      <w:r>
-        <w:t xml:space="preserve">that a threshold change could never have fixed — and the maths showed</w:t>
-      </w:r>
-      <w:r>
-        <w:t xml:space="preserve"> </w:t>
-      </w:r>
-      <w:r>
-        <w:t xml:space="preserve">it explicitly (the "right" query for the true refusal test scored</w:t>
-      </w:r>
-      <w:r>
-        <w:t xml:space="preserve"> </w:t>
-      </w:r>
-      <w:r>
-        <w:rPr>
-          <w:i/>
-        </w:rPr>
-        <w:t xml:space="preserve">between</w:t>
-      </w:r>
-      <w:r>
-        <w:t xml:space="preserve"> </w:t>
-      </w:r>
-      <w:r>
-        <w:t xml:space="preserve">the two problem queries, so no cutoff could separate all</w:t>
-      </w:r>
-      <w:r>
-        <w:t xml:space="preserve"> </w:t>
-      </w:r>
-      <w:r>
-        <w:t xml:space="preserve">three). Retuning the number would have papered over the actual issue.</w:t>
+        <w:t xml:space="preserve">A "confidence score" is often measuring the wrong thing.</w:t>
+      </w:r>
+      <w:r>
+        <w:t xml:space="preserve"> </w:t>
+      </w:r>
+      <w:r>
+        <w:t xml:space="preserve">The</w:t>
+      </w:r>
+      <w:r>
+        <w:t xml:space="preserve"> </w:t>
+      </w:r>
+      <w:r>
+        <w:t xml:space="preserve">cross-encoder's reranked score measures topical relevance between a</w:t>
+      </w:r>
+      <w:r>
+        <w:t xml:space="preserve"> </w:t>
+      </w:r>
+      <w:r>
+        <w:t xml:space="preserve">query and a passage — not whether that passage actually contains the</w:t>
+      </w:r>
+      <w:r>
+        <w:t xml:space="preserve"> </w:t>
+      </w:r>
+      <w:r>
+        <w:t xml:space="preserve">fact being asked for. A query can retrieve the exactly-right document</w:t>
+      </w:r>
+      <w:r>
+        <w:t xml:space="preserve"> </w:t>
+      </w:r>
+      <w:r>
+        <w:t xml:space="preserve">with high confidence and still have no answer inside it (PR title</w:t>
+      </w:r>
+      <w:r>
+        <w:t xml:space="preserve"> </w:t>
+      </w:r>
+      <w:r>
+        <w:t xml:space="preserve">present, author absent) — the system's job then is to say so, not to</w:t>
+      </w:r>
+      <w:r>
+        <w:t xml:space="preserve"> </w:t>
+      </w:r>
+      <w:r>
+        <w:t xml:space="preserve">either hallucinate or refuse outright. That distinction — evidence</w:t>
+      </w:r>
+      <w:r>
+        <w:t xml:space="preserve"> </w:t>
+      </w:r>
+      <w:r>
+        <w:t xml:space="preserve">found vs. evidence sufficient — isn't something a single threshold can</w:t>
+      </w:r>
+      <w:r>
+        <w:t xml:space="preserve"> </w:t>
+      </w:r>
+      <w:r>
+        <w:t xml:space="preserve">fully capture.</w:t>
       </w:r>
     </w:p>
     <w:p>
       <w:pPr>
         <w:numPr>
-          <w:numId w:val="1003"/>
+          <w:numId w:val="1004"/>
           <w:ilvl w:val="0"/>
         </w:numPr>
       </w:pPr>
@@ -2555,7 +2670,7 @@
         <w:rPr>
           <w:b/>
         </w:rPr>
-        <w:t xml:space="preserve">GraphRAG and vector-RAG fail differently, not just "graph wins here,</w:t>
+        <w:t xml:space="preserve">An initial diagnosis of "needs retuning" was too shallow, and saying</w:t>
       </w:r>
       <w:r>
         <w:rPr>
@@ -2567,31 +2682,43 @@
         <w:rPr>
           <w:b/>
         </w:rPr>
-        <w:t xml:space="preserve">vector wins there."</w:t>
-      </w:r>
-      <w:r>
-        <w:t xml:space="preserve"> </w:t>
-      </w:r>
-      <w:r>
-        <w:t xml:space="preserve">The most interesting eval result wasn't which arm</w:t>
-      </w:r>
-      <w:r>
-        <w:t xml:space="preserve"> </w:t>
-      </w:r>
-      <w:r>
-        <w:t xml:space="preserve">won on which query type (though that mostly matched expectations —</w:t>
-      </w:r>
-      <w:r>
-        <w:t xml:space="preserve"> </w:t>
-      </w:r>
-      <w:r>
-        <w:t xml:space="preserve">graph on aggregation, vector on semantic/exploratory) — it was the</w:t>
-      </w:r>
-      <w:r>
-        <w:t xml:space="preserve"> </w:t>
-      </w:r>
-      <w:r>
-        <w:t xml:space="preserve">cases that</w:t>
+        <w:t xml:space="preserve">so explicitly was the right call.</w:t>
+      </w:r>
+      <w:r>
+        <w:t xml:space="preserve"> </w:t>
+      </w:r>
+      <w:r>
+        <w:t xml:space="preserve">The first-pass write-up flagged a</w:t>
+      </w:r>
+      <w:r>
+        <w:t xml:space="preserve"> </w:t>
+      </w:r>
+      <w:r>
+        <w:t xml:space="preserve">confidence threshold as needing recalibration. One level deeper, the</w:t>
+      </w:r>
+      <w:r>
+        <w:t xml:space="preserve"> </w:t>
+      </w:r>
+      <w:r>
+        <w:t xml:space="preserve">real causes were two specific, structural bugs (a missing identifier in</w:t>
+      </w:r>
+      <w:r>
+        <w:t xml:space="preserve"> </w:t>
+      </w:r>
+      <w:r>
+        <w:t xml:space="preserve">indexed text; a reranker blind spot on self-referential-less passages)</w:t>
+      </w:r>
+      <w:r>
+        <w:t xml:space="preserve"> </w:t>
+      </w:r>
+      <w:r>
+        <w:t xml:space="preserve">that a threshold change could never have fixed — and the maths showed</w:t>
+      </w:r>
+      <w:r>
+        <w:t xml:space="preserve"> </w:t>
+      </w:r>
+      <w:r>
+        <w:t xml:space="preserve">it explicitly (the "right" query for the true refusal test scored</w:t>
       </w:r>
       <w:r>
         <w:t xml:space="preserve"> </w:t>
@@ -2600,40 +2727,25 @@
         <w:rPr>
           <w:i/>
         </w:rPr>
-        <w:t xml:space="preserve">flipped</w:t>
-      </w:r>
-      <w:r>
-        <w:t xml:space="preserve">. Two queries expected to favor the graph arm</w:t>
-      </w:r>
-      <w:r>
-        <w:t xml:space="preserve"> </w:t>
-      </w:r>
-      <w:r>
-        <w:t xml:space="preserve">instead got answered by vector, because the graph arm's entity matcher</w:t>
-      </w:r>
-      <w:r>
-        <w:t xml:space="preserve"> </w:t>
-      </w:r>
-      <w:r>
-        <w:t xml:space="preserve">requires a query to literally name a PR/username/module rather than</w:t>
-      </w:r>
-      <w:r>
-        <w:t xml:space="preserve"> </w:t>
-      </w:r>
-      <w:r>
-        <w:t xml:space="preserve">describe it. That's a specific, fixable gap in entity recognition, not</w:t>
-      </w:r>
-      <w:r>
-        <w:t xml:space="preserve"> </w:t>
-      </w:r>
-      <w:r>
-        <w:t xml:space="preserve">a case of "the graph arm is worse."</w:t>
+        <w:t xml:space="preserve">between</w:t>
+      </w:r>
+      <w:r>
+        <w:t xml:space="preserve"> </w:t>
+      </w:r>
+      <w:r>
+        <w:t xml:space="preserve">the two problem queries, so no cutoff could separate all</w:t>
+      </w:r>
+      <w:r>
+        <w:t xml:space="preserve"> </w:t>
+      </w:r>
+      <w:r>
+        <w:t xml:space="preserve">three). Retuning the number would have papered over the actual issue.</w:t>
       </w:r>
     </w:p>
     <w:p>
       <w:pPr>
         <w:numPr>
-          <w:numId w:val="1003"/>
+          <w:numId w:val="1004"/>
           <w:ilvl w:val="0"/>
         </w:numPr>
       </w:pPr>
@@ -2641,61 +2753,85 @@
         <w:rPr>
           <w:b/>
         </w:rPr>
-        <w:t xml:space="preserve">An eval harness needs its own eval.</w:t>
-      </w:r>
-      <w:r>
-        <w:t xml:space="preserve"> </w:t>
-      </w:r>
-      <w:r>
-        <w:t xml:space="preserve">The LLM-judge scoring bug (item</w:t>
-      </w:r>
-      <w:r>
-        <w:t xml:space="preserve"> </w:t>
-      </w:r>
-      <w:r>
-        <w:t xml:space="preserve">5 above) is a reminder that a scoring layer built on the same kind of</w:t>
-      </w:r>
-      <w:r>
-        <w:t xml:space="preserve"> </w:t>
-      </w:r>
-      <w:r>
-        <w:t xml:space="preserve">model it's grading can inherit that model's own quirks (here: adaptive</w:t>
-      </w:r>
-      <w:r>
-        <w:t xml:space="preserve"> </w:t>
-      </w:r>
-      <w:r>
-        <w:t xml:space="preserve">thinking consuming a token budget meant for the visible answer) in ways</w:t>
-      </w:r>
-      <w:r>
-        <w:t xml:space="preserve"> </w:t>
-      </w:r>
-      <w:r>
-        <w:t xml:space="preserve">that produce plausible-looking but wrong numbers. The fix was caught</w:t>
-      </w:r>
-      <w:r>
-        <w:t xml:space="preserve"> </w:t>
-      </w:r>
-      <w:r>
-        <w:t xml:space="preserve">only by manually reading real answers and noticing the scores</w:t>
-      </w:r>
-      <w:r>
-        <w:t xml:space="preserve"> </w:t>
-      </w:r>
-      <w:r>
-        <w:t xml:space="preserve">contradicted them — automated scores were trusted only after that</w:t>
-      </w:r>
-      <w:r>
-        <w:t xml:space="preserve"> </w:t>
-      </w:r>
-      <w:r>
-        <w:t xml:space="preserve">spot-check, not before.</w:t>
+        <w:t xml:space="preserve">GraphRAG and vector-RAG fail differently, not just "graph wins here,</w:t>
+      </w:r>
+      <w:r>
+        <w:rPr>
+          <w:b/>
+        </w:rPr>
+        <w:t xml:space="preserve"> </w:t>
+      </w:r>
+      <w:r>
+        <w:rPr>
+          <w:b/>
+        </w:rPr>
+        <w:t xml:space="preserve">vector wins there."</w:t>
+      </w:r>
+      <w:r>
+        <w:t xml:space="preserve"> </w:t>
+      </w:r>
+      <w:r>
+        <w:t xml:space="preserve">The most interesting eval result wasn't which arm</w:t>
+      </w:r>
+      <w:r>
+        <w:t xml:space="preserve"> </w:t>
+      </w:r>
+      <w:r>
+        <w:t xml:space="preserve">won on which query type (though that mostly matched expectations —</w:t>
+      </w:r>
+      <w:r>
+        <w:t xml:space="preserve"> </w:t>
+      </w:r>
+      <w:r>
+        <w:t xml:space="preserve">graph on aggregation, vector on semantic/exploratory) — it was the</w:t>
+      </w:r>
+      <w:r>
+        <w:t xml:space="preserve"> </w:t>
+      </w:r>
+      <w:r>
+        <w:t xml:space="preserve">cases that</w:t>
+      </w:r>
+      <w:r>
+        <w:t xml:space="preserve"> </w:t>
+      </w:r>
+      <w:r>
+        <w:rPr>
+          <w:i/>
+        </w:rPr>
+        <w:t xml:space="preserve">flipped</w:t>
+      </w:r>
+      <w:r>
+        <w:t xml:space="preserve">. Two queries expected to favor the graph arm</w:t>
+      </w:r>
+      <w:r>
+        <w:t xml:space="preserve"> </w:t>
+      </w:r>
+      <w:r>
+        <w:t xml:space="preserve">instead got answered by vector, because the graph arm's entity matcher</w:t>
+      </w:r>
+      <w:r>
+        <w:t xml:space="preserve"> </w:t>
+      </w:r>
+      <w:r>
+        <w:t xml:space="preserve">requires a query to literally name a PR/username/module rather than</w:t>
+      </w:r>
+      <w:r>
+        <w:t xml:space="preserve"> </w:t>
+      </w:r>
+      <w:r>
+        <w:t xml:space="preserve">describe it. That's a specific, fixable gap in entity recognition, not</w:t>
+      </w:r>
+      <w:r>
+        <w:t xml:space="preserve"> </w:t>
+      </w:r>
+      <w:r>
+        <w:t xml:space="preserve">a case of "the graph arm is worse."</w:t>
       </w:r>
     </w:p>
     <w:p>
       <w:pPr>
         <w:numPr>
-          <w:numId w:val="1003"/>
+          <w:numId w:val="1004"/>
           <w:ilvl w:val="0"/>
         </w:numPr>
       </w:pPr>
@@ -2703,6 +2839,68 @@
         <w:rPr>
           <w:b/>
         </w:rPr>
+        <w:t xml:space="preserve">An eval harness needs its own eval.</w:t>
+      </w:r>
+      <w:r>
+        <w:t xml:space="preserve"> </w:t>
+      </w:r>
+      <w:r>
+        <w:t xml:space="preserve">The LLM-judge scoring bug (item</w:t>
+      </w:r>
+      <w:r>
+        <w:t xml:space="preserve"> </w:t>
+      </w:r>
+      <w:r>
+        <w:t xml:space="preserve">5 above) is a reminder that a scoring layer built on the same kind of</w:t>
+      </w:r>
+      <w:r>
+        <w:t xml:space="preserve"> </w:t>
+      </w:r>
+      <w:r>
+        <w:t xml:space="preserve">model it's grading can inherit that model's own quirks (here: adaptive</w:t>
+      </w:r>
+      <w:r>
+        <w:t xml:space="preserve"> </w:t>
+      </w:r>
+      <w:r>
+        <w:t xml:space="preserve">thinking consuming a token budget meant for the visible answer) in ways</w:t>
+      </w:r>
+      <w:r>
+        <w:t xml:space="preserve"> </w:t>
+      </w:r>
+      <w:r>
+        <w:t xml:space="preserve">that produce plausible-looking but wrong numbers. The fix was caught</w:t>
+      </w:r>
+      <w:r>
+        <w:t xml:space="preserve"> </w:t>
+      </w:r>
+      <w:r>
+        <w:t xml:space="preserve">only by manually reading real answers and noticing the scores</w:t>
+      </w:r>
+      <w:r>
+        <w:t xml:space="preserve"> </w:t>
+      </w:r>
+      <w:r>
+        <w:t xml:space="preserve">contradicted them — automated scores were trusted only after that</w:t>
+      </w:r>
+      <w:r>
+        <w:t xml:space="preserve"> </w:t>
+      </w:r>
+      <w:r>
+        <w:t xml:space="preserve">spot-check, not before.</w:t>
+      </w:r>
+    </w:p>
+    <w:p>
+      <w:pPr>
+        <w:numPr>
+          <w:numId w:val="1004"/>
+          <w:ilvl w:val="0"/>
+        </w:numPr>
+      </w:pPr>
+      <w:r>
+        <w:rPr>
+          <w:b/>
+        </w:rPr>
         <w:t xml:space="preserve">Corpus/query-set mismatch is itself worth documenting, not silently</w:t>
       </w:r>
       <w:r>
@@ -2746,6 +2944,92 @@
       </w:r>
       <w:r>
         <w:t xml:space="preserve">presenting a "clean" result as if that had always been the plan.</w:t>
+      </w:r>
+    </w:p>
+    <w:p>
+      <w:pPr>
+        <w:numPr>
+          <w:numId w:val="1004"/>
+          <w:ilvl w:val="0"/>
+        </w:numPr>
+      </w:pPr>
+      <w:r>
+        <w:rPr>
+          <w:b/>
+        </w:rPr>
+        <w:t xml:space="preserve">Re-checking the original brief against the actual code — not</w:t>
+      </w:r>
+      <w:r>
+        <w:rPr>
+          <w:b/>
+        </w:rPr>
+        <w:t xml:space="preserve"> </w:t>
+      </w:r>
+      <w:r>
+        <w:rPr>
+          <w:b/>
+        </w:rPr>
+        <w:t xml:space="preserve">against memory of what was planned — found a real gap.</w:t>
+      </w:r>
+      <w:r>
+        <w:t xml:space="preserve"> </w:t>
+      </w:r>
+      <w:r>
+        <w:t xml:space="preserve">The graph</w:t>
+      </w:r>
+      <w:r>
+        <w:t xml:space="preserve"> </w:t>
+      </w:r>
+      <w:r>
+        <w:t xml:space="preserve">schema had quietly drifted to four node types instead of the brief's</w:t>
+      </w:r>
+      <w:r>
+        <w:t xml:space="preserve"> </w:t>
+      </w:r>
+      <w:r>
+        <w:t xml:space="preserve">five somewhere between</w:t>
+      </w:r>
+      <w:r>
+        <w:t xml:space="preserve"> </w:t>
+      </w:r>
+      <w:r>
+        <w:rPr>
+          <w:rStyle w:val="VerbatimChar"/>
+        </w:rPr>
+        <w:t xml:space="preserve">docs/SCOPE.md</w:t>
+      </w:r>
+      <w:r>
+        <w:t xml:space="preserve">'s early scoping (a reasonable</w:t>
+      </w:r>
+      <w:r>
+        <w:t xml:space="preserve"> </w:t>
+      </w:r>
+      <w:r>
+        <w:t xml:space="preserve">domain adaptation) and the final implementation, and it went</w:t>
+      </w:r>
+      <w:r>
+        <w:t xml:space="preserve"> </w:t>
+      </w:r>
+      <w:r>
+        <w:t xml:space="preserve">unnoticed through several rounds of testing because every eval query</w:t>
+      </w:r>
+      <w:r>
+        <w:t xml:space="preserve"> </w:t>
+      </w:r>
+      <w:r>
+        <w:t xml:space="preserve">happened to route through the four types that existed. A deliberate</w:t>
+      </w:r>
+      <w:r>
+        <w:t xml:space="preserve"> </w:t>
+      </w:r>
+      <w:r>
+        <w:t xml:space="preserve">line-by-line check against the brief's literal text — not just "does</w:t>
+      </w:r>
+      <w:r>
+        <w:t xml:space="preserve"> </w:t>
+      </w:r>
+      <w:r>
+        <w:t xml:space="preserve">the demo work" — is what surfaced it.</w:t>
       </w:r>
     </w:p>
     <w:sectPr/>
@@ -2856,7 +3140,7 @@
     </w:lvl>
   </w:abstractNum>
   <w:abstractNum w:abstractNumId="990">
-    <w:nsid w:val="cd0078d9"/>
+    <w:nsid w:val="5c46b265"/>
     <w:multiLevelType w:val="multilevel"/>
     <w:lvl w:ilvl="0">
       <w:numFmt w:val="bullet"/>
@@ -2937,7 +3221,7 @@
     </w:lvl>
   </w:abstractNum>
   <w:abstractNum w:abstractNumId="99411">
-    <w:nsid w:val="8811b943"/>
+    <w:nsid w:val="f29c28d2"/>
     <w:multiLevelType w:val="multilevel"/>
     <w:lvl w:ilvl="0">
       <w:start w:val="1"/>
@@ -3025,7 +3309,7 @@
     </w:lvl>
   </w:abstractNum>
   <w:abstractNum w:abstractNumId="991">
-    <w:nsid w:val="6b590a03"/>
+    <w:nsid w:val="7dd434cd"/>
     <w:multiLevelType w:val="multilevel"/>
     <w:lvl w:ilvl="0">
       <w:numFmt w:val="bullet"/>
@@ -3096,6 +3380,94 @@
     <w:lvl w:ilvl="6">
       <w:numFmt w:val="bullet"/>
       <w:lvlText w:val="•"/>
+      <w:lvlJc w:val="left"/>
+      <w:pPr>
+        <w:tabs>
+          <w:tab w:val="num" w:pos="4320"/>
+        </w:tabs>
+        <w:ind w:left="4800" w:hanging="480"/>
+      </w:pPr>
+    </w:lvl>
+  </w:abstractNum>
+  <w:abstractNum w:abstractNumId="99418">
+    <w:nsid w:val="b9b9f69e"/>
+    <w:multiLevelType w:val="multilevel"/>
+    <w:lvl w:ilvl="0">
+      <w:start w:val="8"/>
+      <w:numFmt w:val="decimal"/>
+      <w:lvlText w:val="%1."/>
+      <w:lvlJc w:val="left"/>
+      <w:pPr>
+        <w:tabs>
+          <w:tab w:val="num" w:pos="0"/>
+        </w:tabs>
+        <w:ind w:left="480" w:hanging="480"/>
+      </w:pPr>
+    </w:lvl>
+    <w:lvl w:ilvl="1">
+      <w:start w:val="8"/>
+      <w:numFmt w:val="decimal"/>
+      <w:lvlText w:val="%2."/>
+      <w:lvlJc w:val="left"/>
+      <w:pPr>
+        <w:tabs>
+          <w:tab w:val="num" w:pos="720"/>
+        </w:tabs>
+        <w:ind w:left="1200" w:hanging="480"/>
+      </w:pPr>
+    </w:lvl>
+    <w:lvl w:ilvl="2">
+      <w:start w:val="8"/>
+      <w:numFmt w:val="decimal"/>
+      <w:lvlText w:val="%3."/>
+      <w:lvlJc w:val="left"/>
+      <w:pPr>
+        <w:tabs>
+          <w:tab w:val="num" w:pos="1440"/>
+        </w:tabs>
+        <w:ind w:left="1920" w:hanging="480"/>
+      </w:pPr>
+    </w:lvl>
+    <w:lvl w:ilvl="3">
+      <w:start w:val="8"/>
+      <w:numFmt w:val="decimal"/>
+      <w:lvlText w:val="%4."/>
+      <w:lvlJc w:val="left"/>
+      <w:pPr>
+        <w:tabs>
+          <w:tab w:val="num" w:pos="2160"/>
+        </w:tabs>
+        <w:ind w:left="2640" w:hanging="480"/>
+      </w:pPr>
+    </w:lvl>
+    <w:lvl w:ilvl="4">
+      <w:start w:val="8"/>
+      <w:numFmt w:val="decimal"/>
+      <w:lvlText w:val="%5."/>
+      <w:lvlJc w:val="left"/>
+      <w:pPr>
+        <w:tabs>
+          <w:tab w:val="num" w:pos="2880"/>
+        </w:tabs>
+        <w:ind w:left="3360" w:hanging="480"/>
+      </w:pPr>
+    </w:lvl>
+    <w:lvl w:ilvl="5">
+      <w:start w:val="8"/>
+      <w:numFmt w:val="decimal"/>
+      <w:lvlText w:val="%6."/>
+      <w:lvlJc w:val="left"/>
+      <w:pPr>
+        <w:tabs>
+          <w:tab w:val="num" w:pos="3600"/>
+        </w:tabs>
+        <w:ind w:left="4080" w:hanging="480"/>
+      </w:pPr>
+    </w:lvl>
+    <w:lvl w:ilvl="6">
+      <w:start w:val="8"/>
+      <w:numFmt w:val="decimal"/>
+      <w:lvlText w:val="%7."/>
       <w:lvlJc w:val="left"/>
       <w:pPr>
         <w:tabs>
@@ -3139,6 +3511,30 @@
     <w:abstractNumId w:val="991"/>
   </w:num>
   <w:num w:numId="1003">
+    <w:abstractNumId w:val="99418"/>
+    <w:lvlOverride w:ilvl="0">
+      <w:startOverride w:val="8"/>
+    </w:lvlOverride>
+    <w:lvlOverride w:ilvl="1">
+      <w:startOverride w:val="8"/>
+    </w:lvlOverride>
+    <w:lvlOverride w:ilvl="2">
+      <w:startOverride w:val="8"/>
+    </w:lvlOverride>
+    <w:lvlOverride w:ilvl="3">
+      <w:startOverride w:val="8"/>
+    </w:lvlOverride>
+    <w:lvlOverride w:ilvl="4">
+      <w:startOverride w:val="8"/>
+    </w:lvlOverride>
+    <w:lvlOverride w:ilvl="5">
+      <w:startOverride w:val="8"/>
+    </w:lvlOverride>
+    <w:lvlOverride w:ilvl="6">
+      <w:startOverride w:val="8"/>
+    </w:lvlOverride>
+  </w:num>
+  <w:num w:numId="1004">
     <w:abstractNumId w:val="991"/>
   </w:num>
 </w:numbering>

</xml_diff>

<commit_message>
Add architecture diagram across all documentation
README.md, docs/PLAN.md (replacing its plain-text ASCII version),
docs/SCOPE.md, docs/EVAL_RESULTS.md, and docs/DEMO_SCRIPT.md use a
Mermaid flowchart fence, which renders natively on GitHub with no
separate image asset to keep in sync.

docs/PROJECT_WRITEUP.md becomes .docx via pandoc, and Word/Google Docs
can't render Mermaid fences, so it embeds a rendered PNG instead
(docs/assets/architecture.png, generated once via a local
Playwright/headless-Chromium render of the same Mermaid source, so both
versions stay visually identical). Regenerated PROJECT_WRITEUP.docx and
confirmed the image round-trips correctly.

Co-Authored-By: Claude Sonnet 5 <noreply@anthropic.com>
</commit_message>
<xml_diff>
--- a/docs/PROJECT_WRITEUP.docx
+++ b/docs/PROJECT_WRITEUP.docx
@@ -162,86 +162,76 @@
     </w:p>
     <w:p>
       <w:pPr>
-        <w:pStyle w:val="SourceCode"/>
-      </w:pPr>
+        <w:pStyle w:val="FigureWithCaption"/>
+      </w:pPr>
+      <w:r>
+        <w:drawing>
+          <wp:inline>
+            <wp:extent cx="3810000" cy="3810000"/>
+            <wp:effectExtent b="0" l="0" r="0" t="0"/>
+            <wp:docPr descr="Architecture diagram" title="" id="1" name="Picture"/>
+            <a:graphic>
+              <a:graphicData uri="http://schemas.openxmlformats.org/drawingml/2006/picture">
+                <pic:pic>
+                  <pic:nvPicPr>
+                    <pic:cNvPr descr="assets/architecture.png" id="0" name="Picture"/>
+                    <pic:cNvPicPr>
+                      <a:picLocks noChangeArrowheads="1" noChangeAspect="1"/>
+                    </pic:cNvPicPr>
+                  </pic:nvPicPr>
+                  <pic:blipFill>
+                    <a:blip r:embed="rId24"/>
+                    <a:stretch>
+                      <a:fillRect/>
+                    </a:stretch>
+                  </pic:blipFill>
+                  <pic:spPr bwMode="auto">
+                    <a:xfrm>
+                      <a:off x="0" y="0"/>
+                      <a:ext cx="3810000" cy="3810000"/>
+                    </a:xfrm>
+                    <a:prstGeom prst="rect">
+                      <a:avLst/>
+                    </a:prstGeom>
+                    <a:noFill/>
+                    <a:ln w="9525">
+                      <a:noFill/>
+                      <a:headEnd/>
+                      <a:tailEnd/>
+                    </a:ln>
+                  </pic:spPr>
+                </pic:pic>
+              </a:graphicData>
+            </a:graphic>
+          </wp:inline>
+        </w:drawing>
+      </w:r>
+    </w:p>
+    <w:p>
+      <w:pPr>
+        <w:pStyle w:val="ImageCaption"/>
+      </w:pPr>
+      <w:r>
+        <w:t xml:space="preserve">Architecture diagram</w:t>
+      </w:r>
+    </w:p>
+    <w:p>
+      <w:pPr>
+        <w:pStyle w:val="BodyText"/>
+      </w:pPr>
+      <w:r>
+        <w:t xml:space="preserve">Both arms run in parallel on every query, wired through a LangGraph state</w:t>
+      </w:r>
+      <w:r>
+        <w:t xml:space="preserve"> </w:t>
+      </w:r>
+      <w:r>
+        <w:t xml:space="preserve">machine (</w:t>
+      </w:r>
       <w:r>
         <w:rPr>
           <w:rStyle w:val="VerbatimChar"/>
         </w:rPr>
-        <w:t xml:space="preserve">parse_query</w:t>
-      </w:r>
-      <w:r>
-        <w:br w:type="textWrapping"/>
-      </w:r>
-      <w:r>
-        <w:rPr>
-          <w:rStyle w:val="VerbatimChar"/>
-        </w:rPr>
-        <w:t xml:space="preserve">    ├── retrieve_vector   (hybrid: dense + BM25 → reciprocal-rank fusion → cross-encoder rerank → top-5 chunks)</w:t>
-      </w:r>
-      <w:r>
-        <w:br w:type="textWrapping"/>
-      </w:r>
-      <w:r>
-        <w:rPr>
-          <w:rStyle w:val="VerbatimChar"/>
-        </w:rPr>
-        <w:t xml:space="preserve">    └── retrieve_graph    (entity match → 1-2 hop graph traversal → serialized subgraph)</w:t>
-      </w:r>
-      <w:r>
-        <w:br w:type="textWrapping"/>
-      </w:r>
-      <w:r>
-        <w:rPr>
-          <w:rStyle w:val="VerbatimChar"/>
-        </w:rPr>
-        <w:t xml:space="preserve">            │</w:t>
-      </w:r>
-      <w:r>
-        <w:br w:type="textWrapping"/>
-      </w:r>
-      <w:r>
-        <w:rPr>
-          <w:rStyle w:val="VerbatimChar"/>
-        </w:rPr>
-        <w:t xml:space="preserve">      confidence_gate</w:t>
-      </w:r>
-      <w:r>
-        <w:br w:type="textWrapping"/>
-      </w:r>
-      <w:r>
-        <w:rPr>
-          <w:rStyle w:val="VerbatimChar"/>
-        </w:rPr>
-        <w:t xml:space="preserve">       ├── below threshold (both arms)  → refuse</w:t>
-      </w:r>
-      <w:r>
-        <w:br w:type="textWrapping"/>
-      </w:r>
-      <w:r>
-        <w:rPr>
-          <w:rStyle w:val="VerbatimChar"/>
-        </w:rPr>
-        <w:t xml:space="preserve">       └── sufficient evidence (either arm) → generate cited answer</w:t>
-      </w:r>
-    </w:p>
-    <w:p>
-      <w:pPr>
-        <w:pStyle w:val="FirstParagraph"/>
-      </w:pPr>
-      <w:r>
-        <w:t xml:space="preserve">Both arms run in parallel on every query, wired through a LangGraph state</w:t>
-      </w:r>
-      <w:r>
-        <w:t xml:space="preserve"> </w:t>
-      </w:r>
-      <w:r>
-        <w:t xml:space="preserve">machine (</w:t>
-      </w:r>
-      <w:r>
-        <w:rPr>
-          <w:rStyle w:val="VerbatimChar"/>
-        </w:rPr>
         <w:t xml:space="preserve">app/graph_flow.py</w:t>
       </w:r>
       <w:r>
@@ -291,8 +281,8 @@
       <w:pPr>
         <w:pStyle w:val="Heading3"/>
       </w:pPr>
-      <w:bookmarkStart w:id="24" w:name="stack"/>
-      <w:bookmarkEnd w:id="24"/>
+      <w:bookmarkStart w:id="25" w:name="stack"/>
+      <w:bookmarkEnd w:id="25"/>
       <w:r>
         <w:t xml:space="preserve">Stack</w:t>
       </w:r>
@@ -674,8 +664,8 @@
       <w:pPr>
         <w:pStyle w:val="Heading2"/>
       </w:pPr>
-      <w:bookmarkStart w:id="25" w:name="dataset-used"/>
-      <w:bookmarkEnd w:id="25"/>
+      <w:bookmarkStart w:id="26" w:name="dataset-used"/>
+      <w:bookmarkEnd w:id="26"/>
       <w:r>
         <w:t xml:space="preserve">2. Dataset Used</w:t>
       </w:r>
@@ -1244,8 +1234,8 @@
       <w:pPr>
         <w:pStyle w:val="Heading2"/>
       </w:pPr>
-      <w:bookmarkStart w:id="26" w:name="prompts-agent-instructions-used"/>
-      <w:bookmarkEnd w:id="26"/>
+      <w:bookmarkStart w:id="27" w:name="prompts-agent-instructions-used"/>
+      <w:bookmarkEnd w:id="27"/>
       <w:r>
         <w:t xml:space="preserve">3. Prompts / Agent Instructions Used</w:t>
       </w:r>
@@ -1254,8 +1244,8 @@
       <w:pPr>
         <w:pStyle w:val="Heading3"/>
       </w:pPr>
-      <w:bookmarkStart w:id="27" w:name="generation-system-prompt-appcoregeneration.py"/>
-      <w:bookmarkEnd w:id="27"/>
+      <w:bookmarkStart w:id="28" w:name="generation-system-prompt-appcoregeneration.py"/>
+      <w:bookmarkEnd w:id="28"/>
       <w:r>
         <w:t xml:space="preserve">Generation system prompt (</w:t>
       </w:r>
@@ -1388,8 +1378,8 @@
       <w:pPr>
         <w:pStyle w:val="Heading3"/>
       </w:pPr>
-      <w:bookmarkStart w:id="28" w:name="llm-judge-grading-prompt-appcoreevaluation.py"/>
-      <w:bookmarkEnd w:id="28"/>
+      <w:bookmarkStart w:id="29" w:name="llm-judge-grading-prompt-appcoreevaluation.py"/>
+      <w:bookmarkEnd w:id="29"/>
       <w:r>
         <w:t xml:space="preserve">LLM-judge grading prompt (</w:t>
       </w:r>
@@ -1509,8 +1499,8 @@
       <w:pPr>
         <w:pStyle w:val="Heading3"/>
       </w:pPr>
-      <w:bookmarkStart w:id="29" w:name="refusal-message-appcommonconfig.py"/>
-      <w:bookmarkEnd w:id="29"/>
+      <w:bookmarkStart w:id="30" w:name="refusal-message-appcommonconfig.py"/>
+      <w:bookmarkEnd w:id="30"/>
       <w:r>
         <w:t xml:space="preserve">Refusal message (</w:t>
       </w:r>
@@ -1548,8 +1538,8 @@
       <w:pPr>
         <w:pStyle w:val="Heading2"/>
       </w:pPr>
-      <w:bookmarkStart w:id="30" w:name="iterations-tried"/>
-      <w:bookmarkEnd w:id="30"/>
+      <w:bookmarkStart w:id="31" w:name="iterations-tried"/>
+      <w:bookmarkEnd w:id="31"/>
       <w:r>
         <w:t xml:space="preserve">4. Iterations Tried</w:t>
       </w:r>
@@ -2496,8 +2486,8 @@
       <w:pPr>
         <w:pStyle w:val="Heading2"/>
       </w:pPr>
-      <w:bookmarkStart w:id="31" w:name="learnings-observations"/>
-      <w:bookmarkEnd w:id="31"/>
+      <w:bookmarkStart w:id="32" w:name="learnings-observations"/>
+      <w:bookmarkEnd w:id="32"/>
       <w:r>
         <w:t xml:space="preserve">5. Learnings / Observations</w:t>
       </w:r>
@@ -3140,7 +3130,7 @@
     </w:lvl>
   </w:abstractNum>
   <w:abstractNum w:abstractNumId="990">
-    <w:nsid w:val="5c46b265"/>
+    <w:nsid w:val="396d962f"/>
     <w:multiLevelType w:val="multilevel"/>
     <w:lvl w:ilvl="0">
       <w:numFmt w:val="bullet"/>
@@ -3221,7 +3211,7 @@
     </w:lvl>
   </w:abstractNum>
   <w:abstractNum w:abstractNumId="99411">
-    <w:nsid w:val="f29c28d2"/>
+    <w:nsid w:val="5386623e"/>
     <w:multiLevelType w:val="multilevel"/>
     <w:lvl w:ilvl="0">
       <w:start w:val="1"/>
@@ -3309,7 +3299,7 @@
     </w:lvl>
   </w:abstractNum>
   <w:abstractNum w:abstractNumId="991">
-    <w:nsid w:val="7dd434cd"/>
+    <w:nsid w:val="2a4cee57"/>
     <w:multiLevelType w:val="multilevel"/>
     <w:lvl w:ilvl="0">
       <w:numFmt w:val="bullet"/>
@@ -3390,7 +3380,7 @@
     </w:lvl>
   </w:abstractNum>
   <w:abstractNum w:abstractNumId="99418">
-    <w:nsid w:val="b9b9f69e"/>
+    <w:nsid w:val="c033260c"/>
     <w:multiLevelType w:val="multilevel"/>
     <w:lvl w:ilvl="0">
       <w:start w:val="8"/>

</xml_diff>